<commit_message>
Require checklists in Claude audit workflows
</commit_message>
<xml_diff>
--- a/test-doc/06-requirements-traceability-matrix.docx
+++ b/test-doc/06-requirements-traceability-matrix.docx
@@ -743,7 +743,7 @@
               <w:pStyle w:val="Compact"/>
             </w:pPr>
             <w:r>
-              <w:t xml:space="preserve">Planned</w:t>
+              <w:t xml:space="preserve">Pass</w:t>
             </w:r>
           </w:p>
         </w:tc>
@@ -833,7 +833,7 @@
               <w:pStyle w:val="Compact"/>
             </w:pPr>
             <w:r>
-              <w:t xml:space="preserve">Planned</w:t>
+              <w:t xml:space="preserve">Pass</w:t>
             </w:r>
           </w:p>
         </w:tc>
@@ -923,7 +923,7 @@
               <w:pStyle w:val="Compact"/>
             </w:pPr>
             <w:r>
-              <w:t xml:space="preserve">Planned</w:t>
+              <w:t xml:space="preserve">Pass</w:t>
             </w:r>
           </w:p>
         </w:tc>
@@ -1013,7 +1013,7 @@
               <w:pStyle w:val="Compact"/>
             </w:pPr>
             <w:r>
-              <w:t xml:space="preserve">Planned</w:t>
+              <w:t xml:space="preserve">Pass</w:t>
             </w:r>
           </w:p>
         </w:tc>
@@ -1103,7 +1103,7 @@
               <w:pStyle w:val="Compact"/>
             </w:pPr>
             <w:r>
-              <w:t xml:space="preserve">Planned</w:t>
+              <w:t xml:space="preserve">Pass</w:t>
             </w:r>
           </w:p>
         </w:tc>
@@ -1193,7 +1193,7 @@
               <w:pStyle w:val="Compact"/>
             </w:pPr>
             <w:r>
-              <w:t xml:space="preserve">Planned</w:t>
+              <w:t xml:space="preserve">Pass</w:t>
             </w:r>
           </w:p>
         </w:tc>
@@ -1283,7 +1283,7 @@
               <w:pStyle w:val="Compact"/>
             </w:pPr>
             <w:r>
-              <w:t xml:space="preserve">Planned</w:t>
+              <w:t xml:space="preserve">Pass</w:t>
             </w:r>
           </w:p>
         </w:tc>
@@ -1373,7 +1373,7 @@
               <w:pStyle w:val="Compact"/>
             </w:pPr>
             <w:r>
-              <w:t xml:space="preserve">Planned</w:t>
+              <w:t xml:space="preserve">Pass</w:t>
             </w:r>
           </w:p>
         </w:tc>
@@ -1463,7 +1463,7 @@
               <w:pStyle w:val="Compact"/>
             </w:pPr>
             <w:r>
-              <w:t xml:space="preserve">Planned</w:t>
+              <w:t xml:space="preserve">Pass</w:t>
             </w:r>
           </w:p>
         </w:tc>
@@ -1553,7 +1553,7 @@
               <w:pStyle w:val="Compact"/>
             </w:pPr>
             <w:r>
-              <w:t xml:space="preserve">Planned</w:t>
+              <w:t xml:space="preserve">Pass</w:t>
             </w:r>
           </w:p>
         </w:tc>
@@ -1643,7 +1643,7 @@
               <w:pStyle w:val="Compact"/>
             </w:pPr>
             <w:r>
-              <w:t xml:space="preserve">Planned</w:t>
+              <w:t xml:space="preserve">Pass</w:t>
             </w:r>
           </w:p>
         </w:tc>
@@ -1733,7 +1733,7 @@
               <w:pStyle w:val="Compact"/>
             </w:pPr>
             <w:r>
-              <w:t xml:space="preserve">Planned</w:t>
+              <w:t xml:space="preserve">Pass</w:t>
             </w:r>
           </w:p>
         </w:tc>
@@ -1823,7 +1823,7 @@
               <w:pStyle w:val="Compact"/>
             </w:pPr>
             <w:r>
-              <w:t xml:space="preserve">Planned</w:t>
+              <w:t xml:space="preserve">Pass</w:t>
             </w:r>
           </w:p>
         </w:tc>
@@ -1913,7 +1913,7 @@
               <w:pStyle w:val="Compact"/>
             </w:pPr>
             <w:r>
-              <w:t xml:space="preserve">Planned</w:t>
+              <w:t xml:space="preserve">Pass</w:t>
             </w:r>
           </w:p>
         </w:tc>
@@ -2003,7 +2003,7 @@
               <w:pStyle w:val="Compact"/>
             </w:pPr>
             <w:r>
-              <w:t xml:space="preserve">Planned</w:t>
+              <w:t xml:space="preserve">Pass</w:t>
             </w:r>
           </w:p>
         </w:tc>
@@ -2093,7 +2093,7 @@
               <w:pStyle w:val="Compact"/>
             </w:pPr>
             <w:r>
-              <w:t xml:space="preserve">Planned</w:t>
+              <w:t xml:space="preserve">Pass</w:t>
             </w:r>
           </w:p>
         </w:tc>
@@ -2183,7 +2183,7 @@
               <w:pStyle w:val="Compact"/>
             </w:pPr>
             <w:r>
-              <w:t xml:space="preserve">Planned</w:t>
+              <w:t xml:space="preserve">Pass</w:t>
             </w:r>
           </w:p>
         </w:tc>
@@ -2273,7 +2273,7 @@
               <w:pStyle w:val="Compact"/>
             </w:pPr>
             <w:r>
-              <w:t xml:space="preserve">Planned</w:t>
+              <w:t xml:space="preserve">Pass</w:t>
             </w:r>
           </w:p>
         </w:tc>
@@ -2363,7 +2363,7 @@
               <w:pStyle w:val="Compact"/>
             </w:pPr>
             <w:r>
-              <w:t xml:space="preserve">Planned</w:t>
+              <w:t xml:space="preserve">Pass</w:t>
             </w:r>
           </w:p>
         </w:tc>
@@ -2453,7 +2453,7 @@
               <w:pStyle w:val="Compact"/>
             </w:pPr>
             <w:r>
-              <w:t xml:space="preserve">Planned</w:t>
+              <w:t xml:space="preserve">Pass</w:t>
             </w:r>
           </w:p>
         </w:tc>
@@ -2543,7 +2543,7 @@
               <w:pStyle w:val="Compact"/>
             </w:pPr>
             <w:r>
-              <w:t xml:space="preserve">Planned</w:t>
+              <w:t xml:space="preserve">Pass</w:t>
             </w:r>
           </w:p>
         </w:tc>
@@ -2633,7 +2633,7 @@
               <w:pStyle w:val="Compact"/>
             </w:pPr>
             <w:r>
-              <w:t xml:space="preserve">Planned</w:t>
+              <w:t xml:space="preserve">Pass</w:t>
             </w:r>
           </w:p>
         </w:tc>
@@ -2723,7 +2723,7 @@
               <w:pStyle w:val="Compact"/>
             </w:pPr>
             <w:r>
-              <w:t xml:space="preserve">Planned</w:t>
+              <w:t xml:space="preserve">Pass</w:t>
             </w:r>
           </w:p>
         </w:tc>
@@ -2813,7 +2813,7 @@
               <w:pStyle w:val="Compact"/>
             </w:pPr>
             <w:r>
-              <w:t xml:space="preserve">Planned</w:t>
+              <w:t xml:space="preserve">Pass</w:t>
             </w:r>
           </w:p>
         </w:tc>
@@ -2903,7 +2903,7 @@
               <w:pStyle w:val="Compact"/>
             </w:pPr>
             <w:r>
-              <w:t xml:space="preserve">Planned</w:t>
+              <w:t xml:space="preserve">Pass</w:t>
             </w:r>
           </w:p>
         </w:tc>
@@ -2993,7 +2993,7 @@
               <w:pStyle w:val="Compact"/>
             </w:pPr>
             <w:r>
-              <w:t xml:space="preserve">Planned</w:t>
+              <w:t xml:space="preserve">Pass</w:t>
             </w:r>
           </w:p>
         </w:tc>
@@ -3083,7 +3083,7 @@
               <w:pStyle w:val="Compact"/>
             </w:pPr>
             <w:r>
-              <w:t xml:space="preserve">Planned</w:t>
+              <w:t xml:space="preserve">Pass</w:t>
             </w:r>
           </w:p>
         </w:tc>
@@ -3173,7 +3173,7 @@
               <w:pStyle w:val="Compact"/>
             </w:pPr>
             <w:r>
-              <w:t xml:space="preserve">Planned</w:t>
+              <w:t xml:space="preserve">Pass</w:t>
             </w:r>
           </w:p>
         </w:tc>
@@ -3263,7 +3263,7 @@
               <w:pStyle w:val="Compact"/>
             </w:pPr>
             <w:r>
-              <w:t xml:space="preserve">Planned</w:t>
+              <w:t xml:space="preserve">Pass</w:t>
             </w:r>
           </w:p>
         </w:tc>
@@ -3623,7 +3623,7 @@
               <w:pStyle w:val="Compact"/>
             </w:pPr>
             <w:r>
-              <w:t xml:space="preserve">Planned</w:t>
+              <w:t xml:space="preserve">Pass</w:t>
             </w:r>
           </w:p>
         </w:tc>
@@ -3803,7 +3803,7 @@
               <w:pStyle w:val="Compact"/>
             </w:pPr>
             <w:r>
-              <w:t xml:space="preserve">Planned</w:t>
+              <w:t xml:space="preserve">Pass</w:t>
             </w:r>
           </w:p>
         </w:tc>
@@ -3893,7 +3893,7 @@
               <w:pStyle w:val="Compact"/>
             </w:pPr>
             <w:r>
-              <w:t xml:space="preserve">Planned</w:t>
+              <w:t xml:space="preserve">Pass</w:t>
             </w:r>
           </w:p>
         </w:tc>

</xml_diff>

<commit_message>
Add audit status guards and NFR coverage
</commit_message>
<xml_diff>
--- a/test-doc/06-requirements-traceability-matrix.docx
+++ b/test-doc/06-requirements-traceability-matrix.docx
@@ -3353,7 +3353,7 @@
               <w:pStyle w:val="Compact"/>
             </w:pPr>
             <w:r>
-              <w:t xml:space="preserve">Planned</w:t>
+              <w:t xml:space="preserve">Pass</w:t>
             </w:r>
           </w:p>
         </w:tc>
@@ -3443,7 +3443,7 @@
               <w:pStyle w:val="Compact"/>
             </w:pPr>
             <w:r>
-              <w:t xml:space="preserve">Planned</w:t>
+              <w:t xml:space="preserve">Pass</w:t>
             </w:r>
           </w:p>
         </w:tc>

</xml_diff>

<commit_message>
Regenerate test docs and repository exports
</commit_message>
<xml_diff>
--- a/test-doc/06-requirements-traceability-matrix.docx
+++ b/test-doc/06-requirements-traceability-matrix.docx
@@ -2,7 +2,7 @@
 <file path=word/document.xml><?xml version="1.0" encoding="utf-8"?>
 <w:document xmlns:w="http://schemas.openxmlformats.org/wordprocessingml/2006/main" xmlns:m="http://schemas.openxmlformats.org/officeDocument/2006/math" xmlns:r="http://schemas.openxmlformats.org/officeDocument/2006/relationships" xmlns:o="urn:schemas-microsoft-com:office:office" xmlns:v="urn:schemas-microsoft-com:vml" xmlns:w10="urn:schemas-microsoft-com:office:word" xmlns:a="http://schemas.openxmlformats.org/drawingml/2006/main" xmlns:pic="http://schemas.openxmlformats.org/drawingml/2006/picture" xmlns:wp="http://schemas.openxmlformats.org/drawingml/2006/wordprocessingDrawing">
   <w:body>
-    <w:bookmarkStart w:id="29" w:name="requirements-traceability-matrix-rtm"/>
+    <w:bookmarkStart w:id="30" w:name="requirements-traceability-matrix-rtm"/>
     <w:p>
       <w:pPr>
         <w:pStyle w:val="Heading1"/>
@@ -4557,7 +4557,7 @@
       </w:r>
     </w:p>
     <w:bookmarkEnd w:id="17"/>
-    <w:bookmarkStart w:id="19" w:name="automation-artifact-mapping-illustrative"/>
+    <w:bookmarkStart w:id="20" w:name="automation-artifact-mapping-illustrative"/>
     <w:p>
       <w:pPr>
         <w:pStyle w:val="Heading2"/>
@@ -4654,7 +4654,23 @@
         </w:r>
       </w:hyperlink>
       <w:r>
-        <w:t xml:space="preserve">. It currently contains TC-001 through TC-015 with step-level RequirementID, StepDescription, ExpectedOutput, and TestData fields. The ingestion DB loads those rows into</w:t>
+        <w:t xml:space="preserve">. It currently contains</w:t>
+      </w:r>
+      <w:r>
+        <w:t xml:space="preserve"> </w:t>
+      </w:r>
+      <w:r>
+        <w:rPr>
+          <w:b/>
+          <w:bCs/>
+        </w:rPr>
+        <w:t xml:space="preserve">TC-001 through TC-016</w:t>
+      </w:r>
+      <w:r>
+        <w:t xml:space="preserve"> </w:t>
+      </w:r>
+      <w:r>
+        <w:t xml:space="preserve">with step-level RequirementID, StepDescription, ExpectedOutput, and TestData fields. The ingestion DB loads those rows into</w:t>
       </w:r>
       <w:r>
         <w:t xml:space="preserve"> </w:t>
@@ -4687,21 +4703,13 @@
         <w:t xml:space="preserve">for exact inventory counts.</w:t>
       </w:r>
     </w:p>
-    <w:p>
-      <w:r>
-        <w:pict>
-          <v:rect style="width:0;height:1.5pt" o:hralign="center" o:hrstd="t" o:hr="t"/>
-        </w:pict>
-      </w:r>
-    </w:p>
-    <w:bookmarkEnd w:id="19"/>
-    <w:bookmarkStart w:id="20" w:name="change-process"/>
+    <w:bookmarkStart w:id="19" w:name="Xffc432850493674589435cfe69f8f825caaefd9"/>
     <w:p>
       <w:pPr>
-        <w:pStyle w:val="Heading2"/>
+        <w:pStyle w:val="Heading3"/>
       </w:pPr>
       <w:r>
-        <w:t xml:space="preserve">7. Change process</w:t>
+        <w:t xml:space="preserve">Legacy TC-ID to current KB-ID cross-reference</w:t>
       </w:r>
     </w:p>
     <w:p>
@@ -4709,9 +4717,1819 @@
         <w:pStyle w:val="FirstParagraph"/>
       </w:pPr>
       <w:r>
-        <w:t xml:space="preserve">RTM updates require: REQ change in FRS → new row → tracker sync → TDS TD block.</w:t>
+        <w:t xml:space="preserve">The master traceability table above (§3) uses legacy domain-scoped TC-ID labels (e.g. </w:t>
+      </w:r>
+      <w:r>
+        <w:rPr>
+          <w:rStyle w:val="VerbatimChar"/>
+        </w:rPr>
+        <w:t xml:space="preserve">TC-AUTH-001</w:t>
+      </w:r>
+      <w:r>
+        <w:t xml:space="preserve">,</w:t>
+      </w:r>
+      <w:r>
+        <w:t xml:space="preserve"> </w:t>
+      </w:r>
+      <w:r>
+        <w:rPr>
+          <w:rStyle w:val="VerbatimChar"/>
+        </w:rPr>
+        <w:t xml:space="preserve">TC-NFR-001</w:t>
+      </w:r>
+      <w:r>
+        <w:t xml:space="preserve">). The ingestion KB and Playwright runner use a sequential numeric scheme (</w:t>
+      </w:r>
+      <w:r>
+        <w:rPr>
+          <w:rStyle w:val="VerbatimChar"/>
+        </w:rPr>
+        <w:t xml:space="preserve">TC-001</w:t>
+      </w:r>
+      <w:r>
+        <w:t xml:space="preserve"> </w:t>
+      </w:r>
+      <w:r>
+        <w:t xml:space="preserve">through</w:t>
+      </w:r>
+      <w:r>
+        <w:t xml:space="preserve"> </w:t>
+      </w:r>
+      <w:r>
+        <w:rPr>
+          <w:rStyle w:val="VerbatimChar"/>
+        </w:rPr>
+        <w:t xml:space="preserve">TC-016</w:t>
+      </w:r>
+      <w:r>
+        <w:t xml:space="preserve">). The mapping between the two conventions is:</w:t>
       </w:r>
     </w:p>
+    <w:tbl>
+      <w:tblPr>
+        <w:tblStyle w:val="Table"/>
+        <w:tblW w:type="pct" w:w="5000"/>
+        <w:tblLayout w:type="fixed"/>
+        <w:tblLook w:firstRow="1" w:lastRow="0" w:firstColumn="0" w:lastColumn="0" w:noHBand="0" w:noVBand="0" w:val="0020"/>
+      </w:tblPr>
+      <w:tblGrid>
+        <w:gridCol w:w="1980"/>
+        <w:gridCol w:w="1980"/>
+        <w:gridCol w:w="1980"/>
+        <w:gridCol w:w="1980"/>
+      </w:tblGrid>
+      <w:tr>
+        <w:trPr>
+          <w:tblHeader w:val="on"/>
+        </w:trPr>
+        <w:tc>
+          <w:tcPr/>
+          <w:p>
+            <w:pPr>
+              <w:pStyle w:val="Compact"/>
+            </w:pPr>
+            <w:r>
+              <w:t xml:space="preserve">Legacy TC-ID (§3 RTM)</w:t>
+            </w:r>
+          </w:p>
+        </w:tc>
+        <w:tc>
+          <w:tcPr/>
+          <w:p>
+            <w:pPr>
+              <w:pStyle w:val="Compact"/>
+            </w:pPr>
+            <w:r>
+              <w:t xml:space="preserve">Current KB ID</w:t>
+            </w:r>
+          </w:p>
+        </w:tc>
+        <w:tc>
+          <w:tcPr/>
+          <w:p>
+            <w:pPr>
+              <w:pStyle w:val="Compact"/>
+            </w:pPr>
+            <w:r>
+              <w:t xml:space="preserve">REQ covered</w:t>
+            </w:r>
+          </w:p>
+        </w:tc>
+        <w:tc>
+          <w:tcPr/>
+          <w:p>
+            <w:pPr>
+              <w:pStyle w:val="Compact"/>
+            </w:pPr>
+            <w:r>
+              <w:t xml:space="preserve">Suite</w:t>
+            </w:r>
+          </w:p>
+        </w:tc>
+      </w:tr>
+      <w:tr>
+        <w:tc>
+          <w:tcPr/>
+          <w:p>
+            <w:pPr>
+              <w:pStyle w:val="Compact"/>
+            </w:pPr>
+            <w:r>
+              <w:t xml:space="preserve">TC-AUTH-001</w:t>
+            </w:r>
+          </w:p>
+        </w:tc>
+        <w:tc>
+          <w:tcPr/>
+          <w:p>
+            <w:pPr>
+              <w:pStyle w:val="Compact"/>
+            </w:pPr>
+            <w:r>
+              <w:t xml:space="preserve">TC-006</w:t>
+            </w:r>
+          </w:p>
+        </w:tc>
+        <w:tc>
+          <w:tcPr/>
+          <w:p>
+            <w:pPr>
+              <w:pStyle w:val="Compact"/>
+            </w:pPr>
+            <w:r>
+              <w:t xml:space="preserve">REQ-FR-001, REQ-FR-004, REQ-FR-005</w:t>
+            </w:r>
+          </w:p>
+        </w:tc>
+        <w:tc>
+          <w:tcPr/>
+          <w:p>
+            <w:pPr>
+              <w:pStyle w:val="Compact"/>
+            </w:pPr>
+            <w:r>
+              <w:t xml:space="preserve">S-3 Negative</w:t>
+            </w:r>
+          </w:p>
+        </w:tc>
+      </w:tr>
+      <w:tr>
+        <w:tc>
+          <w:tcPr/>
+          <w:p>
+            <w:pPr>
+              <w:pStyle w:val="Compact"/>
+            </w:pPr>
+            <w:r>
+              <w:t xml:space="preserve">TC-AUTH-002</w:t>
+            </w:r>
+          </w:p>
+        </w:tc>
+        <w:tc>
+          <w:tcPr/>
+          <w:p>
+            <w:pPr>
+              <w:pStyle w:val="Compact"/>
+            </w:pPr>
+            <w:r>
+              <w:t xml:space="preserve">TC-007</w:t>
+            </w:r>
+          </w:p>
+        </w:tc>
+        <w:tc>
+          <w:tcPr/>
+          <w:p>
+            <w:pPr>
+              <w:pStyle w:val="Compact"/>
+            </w:pPr>
+            <w:r>
+              <w:t xml:space="preserve">REQ-FR-002, REQ-FR-005, REQ-FR-014, REQ-SEC-002</w:t>
+            </w:r>
+          </w:p>
+        </w:tc>
+        <w:tc>
+          <w:tcPr/>
+          <w:p>
+            <w:pPr>
+              <w:pStyle w:val="Compact"/>
+            </w:pPr>
+            <w:r>
+              <w:t xml:space="preserve">S-3 Negative</w:t>
+            </w:r>
+          </w:p>
+        </w:tc>
+      </w:tr>
+      <w:tr>
+        <w:tc>
+          <w:tcPr/>
+          <w:p>
+            <w:pPr>
+              <w:pStyle w:val="Compact"/>
+            </w:pPr>
+            <w:r>
+              <w:t xml:space="preserve">TC-AUTH-003</w:t>
+            </w:r>
+          </w:p>
+        </w:tc>
+        <w:tc>
+          <w:tcPr/>
+          <w:p>
+            <w:pPr>
+              <w:pStyle w:val="Compact"/>
+            </w:pPr>
+            <w:r>
+              <w:t xml:space="preserve">TC-013</w:t>
+            </w:r>
+          </w:p>
+        </w:tc>
+        <w:tc>
+          <w:tcPr/>
+          <w:p>
+            <w:pPr>
+              <w:pStyle w:val="Compact"/>
+            </w:pPr>
+            <w:r>
+              <w:t xml:space="preserve">REQ-FR-002, REQ-FR-003, REQ-FR-011, REQ-FR-014, REQ-SEC-001</w:t>
+            </w:r>
+          </w:p>
+        </w:tc>
+        <w:tc>
+          <w:tcPr/>
+          <w:p>
+            <w:pPr>
+              <w:pStyle w:val="Compact"/>
+            </w:pPr>
+            <w:r>
+              <w:t xml:space="preserve">S-4 Detailed Regression</w:t>
+            </w:r>
+          </w:p>
+        </w:tc>
+      </w:tr>
+      <w:tr>
+        <w:tc>
+          <w:tcPr/>
+          <w:p>
+            <w:pPr>
+              <w:pStyle w:val="Compact"/>
+            </w:pPr>
+            <w:r>
+              <w:t xml:space="preserve">TC-AUTH-004</w:t>
+            </w:r>
+          </w:p>
+        </w:tc>
+        <w:tc>
+          <w:tcPr/>
+          <w:p>
+            <w:pPr>
+              <w:pStyle w:val="Compact"/>
+            </w:pPr>
+            <w:r>
+              <w:t xml:space="preserve">TC-006</w:t>
+            </w:r>
+          </w:p>
+        </w:tc>
+        <w:tc>
+          <w:tcPr/>
+          <w:p>
+            <w:pPr>
+              <w:pStyle w:val="Compact"/>
+            </w:pPr>
+            <w:r>
+              <w:t xml:space="preserve">REQ-FR-004</w:t>
+            </w:r>
+          </w:p>
+        </w:tc>
+        <w:tc>
+          <w:tcPr/>
+          <w:p>
+            <w:pPr>
+              <w:pStyle w:val="Compact"/>
+            </w:pPr>
+            <w:r>
+              <w:t xml:space="preserve">S-3 Negative</w:t>
+            </w:r>
+          </w:p>
+        </w:tc>
+      </w:tr>
+      <w:tr>
+        <w:tc>
+          <w:tcPr/>
+          <w:p>
+            <w:pPr>
+              <w:pStyle w:val="Compact"/>
+            </w:pPr>
+            <w:r>
+              <w:t xml:space="preserve">TC-AUTH-005</w:t>
+            </w:r>
+          </w:p>
+        </w:tc>
+        <w:tc>
+          <w:tcPr/>
+          <w:p>
+            <w:pPr>
+              <w:pStyle w:val="Compact"/>
+            </w:pPr>
+            <w:r>
+              <w:t xml:space="preserve">TC-007</w:t>
+            </w:r>
+          </w:p>
+        </w:tc>
+        <w:tc>
+          <w:tcPr/>
+          <w:p>
+            <w:pPr>
+              <w:pStyle w:val="Compact"/>
+            </w:pPr>
+            <w:r>
+              <w:t xml:space="preserve">REQ-FR-005</w:t>
+            </w:r>
+          </w:p>
+        </w:tc>
+        <w:tc>
+          <w:tcPr/>
+          <w:p>
+            <w:pPr>
+              <w:pStyle w:val="Compact"/>
+            </w:pPr>
+            <w:r>
+              <w:t xml:space="preserve">S-3 Negative</w:t>
+            </w:r>
+          </w:p>
+        </w:tc>
+      </w:tr>
+      <w:tr>
+        <w:tc>
+          <w:tcPr/>
+          <w:p>
+            <w:pPr>
+              <w:pStyle w:val="Compact"/>
+            </w:pPr>
+            <w:r>
+              <w:t xml:space="preserve">TC-NAV-001</w:t>
+            </w:r>
+          </w:p>
+        </w:tc>
+        <w:tc>
+          <w:tcPr/>
+          <w:p>
+            <w:pPr>
+              <w:pStyle w:val="Compact"/>
+            </w:pPr>
+            <w:r>
+              <w:t xml:space="preserve">TC-008</w:t>
+            </w:r>
+          </w:p>
+        </w:tc>
+        <w:tc>
+          <w:tcPr/>
+          <w:p>
+            <w:pPr>
+              <w:pStyle w:val="Compact"/>
+            </w:pPr>
+            <w:r>
+              <w:t xml:space="preserve">REQ-FR-010, REQ-FR-012, REQ-FR-013, REQ-FR-014</w:t>
+            </w:r>
+          </w:p>
+        </w:tc>
+        <w:tc>
+          <w:tcPr/>
+          <w:p>
+            <w:pPr>
+              <w:pStyle w:val="Compact"/>
+            </w:pPr>
+            <w:r>
+              <w:t xml:space="preserve">S-2 Navigation</w:t>
+            </w:r>
+          </w:p>
+        </w:tc>
+      </w:tr>
+      <w:tr>
+        <w:tc>
+          <w:tcPr/>
+          <w:p>
+            <w:pPr>
+              <w:pStyle w:val="Compact"/>
+            </w:pPr>
+            <w:r>
+              <w:t xml:space="preserve">TC-NAV-002</w:t>
+            </w:r>
+          </w:p>
+        </w:tc>
+        <w:tc>
+          <w:tcPr/>
+          <w:p>
+            <w:pPr>
+              <w:pStyle w:val="Compact"/>
+            </w:pPr>
+            <w:r>
+              <w:t xml:space="preserve">TC-013</w:t>
+            </w:r>
+          </w:p>
+        </w:tc>
+        <w:tc>
+          <w:tcPr/>
+          <w:p>
+            <w:pPr>
+              <w:pStyle w:val="Compact"/>
+            </w:pPr>
+            <w:r>
+              <w:t xml:space="preserve">REQ-FR-011, REQ-SEC-001</w:t>
+            </w:r>
+          </w:p>
+        </w:tc>
+        <w:tc>
+          <w:tcPr/>
+          <w:p>
+            <w:pPr>
+              <w:pStyle w:val="Compact"/>
+            </w:pPr>
+            <w:r>
+              <w:t xml:space="preserve">S-4 Detailed Regression</w:t>
+            </w:r>
+          </w:p>
+        </w:tc>
+      </w:tr>
+      <w:tr>
+        <w:tc>
+          <w:tcPr/>
+          <w:p>
+            <w:pPr>
+              <w:pStyle w:val="Compact"/>
+            </w:pPr>
+            <w:r>
+              <w:t xml:space="preserve">TC-NAV-003</w:t>
+            </w:r>
+          </w:p>
+        </w:tc>
+        <w:tc>
+          <w:tcPr/>
+          <w:p>
+            <w:pPr>
+              <w:pStyle w:val="Compact"/>
+            </w:pPr>
+            <w:r>
+              <w:t xml:space="preserve">TC-008</w:t>
+            </w:r>
+          </w:p>
+        </w:tc>
+        <w:tc>
+          <w:tcPr/>
+          <w:p>
+            <w:pPr>
+              <w:pStyle w:val="Compact"/>
+            </w:pPr>
+            <w:r>
+              <w:t xml:space="preserve">REQ-FR-012</w:t>
+            </w:r>
+          </w:p>
+        </w:tc>
+        <w:tc>
+          <w:tcPr/>
+          <w:p>
+            <w:pPr>
+              <w:pStyle w:val="Compact"/>
+            </w:pPr>
+            <w:r>
+              <w:t xml:space="preserve">S-2 Navigation</w:t>
+            </w:r>
+          </w:p>
+        </w:tc>
+      </w:tr>
+      <w:tr>
+        <w:tc>
+          <w:tcPr/>
+          <w:p>
+            <w:pPr>
+              <w:pStyle w:val="Compact"/>
+            </w:pPr>
+            <w:r>
+              <w:t xml:space="preserve">TC-NAV-004</w:t>
+            </w:r>
+          </w:p>
+        </w:tc>
+        <w:tc>
+          <w:tcPr/>
+          <w:p>
+            <w:pPr>
+              <w:pStyle w:val="Compact"/>
+            </w:pPr>
+            <w:r>
+              <w:t xml:space="preserve">TC-015</w:t>
+            </w:r>
+          </w:p>
+        </w:tc>
+        <w:tc>
+          <w:tcPr/>
+          <w:p>
+            <w:pPr>
+              <w:pStyle w:val="Compact"/>
+            </w:pPr>
+            <w:r>
+              <w:t xml:space="preserve">REQ-FR-013, REQ-FR-060</w:t>
+            </w:r>
+          </w:p>
+        </w:tc>
+        <w:tc>
+          <w:tcPr/>
+          <w:p>
+            <w:pPr>
+              <w:pStyle w:val="Compact"/>
+            </w:pPr>
+            <w:r>
+              <w:t xml:space="preserve">S-2 Navigation</w:t>
+            </w:r>
+          </w:p>
+        </w:tc>
+      </w:tr>
+      <w:tr>
+        <w:tc>
+          <w:tcPr/>
+          <w:p>
+            <w:pPr>
+              <w:pStyle w:val="Compact"/>
+            </w:pPr>
+            <w:r>
+              <w:t xml:space="preserve">TC-NAV-005</w:t>
+            </w:r>
+          </w:p>
+        </w:tc>
+        <w:tc>
+          <w:tcPr/>
+          <w:p>
+            <w:pPr>
+              <w:pStyle w:val="Compact"/>
+            </w:pPr>
+            <w:r>
+              <w:t xml:space="preserve">TC-007</w:t>
+            </w:r>
+          </w:p>
+        </w:tc>
+        <w:tc>
+          <w:tcPr/>
+          <w:p>
+            <w:pPr>
+              <w:pStyle w:val="Compact"/>
+            </w:pPr>
+            <w:r>
+              <w:t xml:space="preserve">REQ-FR-014</w:t>
+            </w:r>
+          </w:p>
+        </w:tc>
+        <w:tc>
+          <w:tcPr/>
+          <w:p>
+            <w:pPr>
+              <w:pStyle w:val="Compact"/>
+            </w:pPr>
+            <w:r>
+              <w:t xml:space="preserve">S-3 Negative</w:t>
+            </w:r>
+          </w:p>
+        </w:tc>
+      </w:tr>
+      <w:tr>
+        <w:tc>
+          <w:tcPr/>
+          <w:p>
+            <w:pPr>
+              <w:pStyle w:val="Compact"/>
+            </w:pPr>
+            <w:r>
+              <w:t xml:space="preserve">TC-DASH-001</w:t>
+            </w:r>
+          </w:p>
+        </w:tc>
+        <w:tc>
+          <w:tcPr/>
+          <w:p>
+            <w:pPr>
+              <w:pStyle w:val="Compact"/>
+            </w:pPr>
+            <w:r>
+              <w:t xml:space="preserve">TC-002</w:t>
+            </w:r>
+          </w:p>
+        </w:tc>
+        <w:tc>
+          <w:tcPr/>
+          <w:p>
+            <w:pPr>
+              <w:pStyle w:val="Compact"/>
+            </w:pPr>
+            <w:r>
+              <w:t xml:space="preserve">REQ-FR-020, REQ-FR-022</w:t>
+            </w:r>
+          </w:p>
+        </w:tc>
+        <w:tc>
+          <w:tcPr/>
+          <w:p>
+            <w:pPr>
+              <w:pStyle w:val="Compact"/>
+            </w:pPr>
+            <w:r>
+              <w:t xml:space="preserve">S-4 Detailed Regression</w:t>
+            </w:r>
+          </w:p>
+        </w:tc>
+      </w:tr>
+      <w:tr>
+        <w:tc>
+          <w:tcPr/>
+          <w:p>
+            <w:pPr>
+              <w:pStyle w:val="Compact"/>
+            </w:pPr>
+            <w:r>
+              <w:t xml:space="preserve">TC-DASH-002</w:t>
+            </w:r>
+          </w:p>
+        </w:tc>
+        <w:tc>
+          <w:tcPr/>
+          <w:p>
+            <w:pPr>
+              <w:pStyle w:val="Compact"/>
+            </w:pPr>
+            <w:r>
+              <w:t xml:space="preserve">TC-010</w:t>
+            </w:r>
+          </w:p>
+        </w:tc>
+        <w:tc>
+          <w:tcPr/>
+          <w:p>
+            <w:pPr>
+              <w:pStyle w:val="Compact"/>
+            </w:pPr>
+            <w:r>
+              <w:t xml:space="preserve">REQ-FR-021</w:t>
+            </w:r>
+          </w:p>
+        </w:tc>
+        <w:tc>
+          <w:tcPr/>
+          <w:p>
+            <w:pPr>
+              <w:pStyle w:val="Compact"/>
+            </w:pPr>
+            <w:r>
+              <w:t xml:space="preserve">S-4 Detailed Regression</w:t>
+            </w:r>
+          </w:p>
+        </w:tc>
+      </w:tr>
+      <w:tr>
+        <w:tc>
+          <w:tcPr/>
+          <w:p>
+            <w:pPr>
+              <w:pStyle w:val="Compact"/>
+            </w:pPr>
+            <w:r>
+              <w:t xml:space="preserve">TC-DASH-003</w:t>
+            </w:r>
+          </w:p>
+        </w:tc>
+        <w:tc>
+          <w:tcPr/>
+          <w:p>
+            <w:pPr>
+              <w:pStyle w:val="Compact"/>
+            </w:pPr>
+            <w:r>
+              <w:t xml:space="preserve">TC-001, TC-010</w:t>
+            </w:r>
+          </w:p>
+        </w:tc>
+        <w:tc>
+          <w:tcPr/>
+          <w:p>
+            <w:pPr>
+              <w:pStyle w:val="Compact"/>
+            </w:pPr>
+            <w:r>
+              <w:t xml:space="preserve">REQ-FR-022</w:t>
+            </w:r>
+          </w:p>
+        </w:tc>
+        <w:tc>
+          <w:tcPr/>
+          <w:p>
+            <w:pPr>
+              <w:pStyle w:val="Compact"/>
+            </w:pPr>
+            <w:r>
+              <w:t xml:space="preserve">S-1 Smoke, S-4 Regression</w:t>
+            </w:r>
+          </w:p>
+        </w:tc>
+      </w:tr>
+      <w:tr>
+        <w:tc>
+          <w:tcPr/>
+          <w:p>
+            <w:pPr>
+              <w:pStyle w:val="Compact"/>
+            </w:pPr>
+            <w:r>
+              <w:t xml:space="preserve">TC-DASH-004</w:t>
+            </w:r>
+          </w:p>
+        </w:tc>
+        <w:tc>
+          <w:tcPr/>
+          <w:p>
+            <w:pPr>
+              <w:pStyle w:val="Compact"/>
+            </w:pPr>
+            <w:r>
+              <w:t xml:space="preserve">TC-010</w:t>
+            </w:r>
+          </w:p>
+        </w:tc>
+        <w:tc>
+          <w:tcPr/>
+          <w:p>
+            <w:pPr>
+              <w:pStyle w:val="Compact"/>
+            </w:pPr>
+            <w:r>
+              <w:t xml:space="preserve">REQ-FR-023</w:t>
+            </w:r>
+          </w:p>
+        </w:tc>
+        <w:tc>
+          <w:tcPr/>
+          <w:p>
+            <w:pPr>
+              <w:pStyle w:val="Compact"/>
+            </w:pPr>
+            <w:r>
+              <w:t xml:space="preserve">S-4 Detailed Regression</w:t>
+            </w:r>
+          </w:p>
+        </w:tc>
+      </w:tr>
+      <w:tr>
+        <w:tc>
+          <w:tcPr/>
+          <w:p>
+            <w:pPr>
+              <w:pStyle w:val="Compact"/>
+            </w:pPr>
+            <w:r>
+              <w:t xml:space="preserve">TC-TRADE-001</w:t>
+            </w:r>
+          </w:p>
+        </w:tc>
+        <w:tc>
+          <w:tcPr/>
+          <w:p>
+            <w:pPr>
+              <w:pStyle w:val="Compact"/>
+            </w:pPr>
+            <w:r>
+              <w:t xml:space="preserve">TC-001, TC-004, TC-014</w:t>
+            </w:r>
+          </w:p>
+        </w:tc>
+        <w:tc>
+          <w:tcPr/>
+          <w:p>
+            <w:pPr>
+              <w:pStyle w:val="Compact"/>
+            </w:pPr>
+            <w:r>
+              <w:t xml:space="preserve">REQ-FR-030</w:t>
+            </w:r>
+          </w:p>
+        </w:tc>
+        <w:tc>
+          <w:tcPr/>
+          <w:p>
+            <w:pPr>
+              <w:pStyle w:val="Compact"/>
+            </w:pPr>
+            <w:r>
+              <w:t xml:space="preserve">S-1 Smoke, S-4 Regression</w:t>
+            </w:r>
+          </w:p>
+        </w:tc>
+      </w:tr>
+      <w:tr>
+        <w:tc>
+          <w:tcPr/>
+          <w:p>
+            <w:pPr>
+              <w:pStyle w:val="Compact"/>
+            </w:pPr>
+            <w:r>
+              <w:t xml:space="preserve">TC-TRADE-002</w:t>
+            </w:r>
+          </w:p>
+        </w:tc>
+        <w:tc>
+          <w:tcPr/>
+          <w:p>
+            <w:pPr>
+              <w:pStyle w:val="Compact"/>
+            </w:pPr>
+            <w:r>
+              <w:t xml:space="preserve">TC-001, TC-014</w:t>
+            </w:r>
+          </w:p>
+        </w:tc>
+        <w:tc>
+          <w:tcPr/>
+          <w:p>
+            <w:pPr>
+              <w:pStyle w:val="Compact"/>
+            </w:pPr>
+            <w:r>
+              <w:t xml:space="preserve">REQ-FR-031</w:t>
+            </w:r>
+          </w:p>
+        </w:tc>
+        <w:tc>
+          <w:tcPr/>
+          <w:p>
+            <w:pPr>
+              <w:pStyle w:val="Compact"/>
+            </w:pPr>
+            <w:r>
+              <w:t xml:space="preserve">S-1 Smoke, S-4 Regression</w:t>
+            </w:r>
+          </w:p>
+        </w:tc>
+      </w:tr>
+      <w:tr>
+        <w:tc>
+          <w:tcPr/>
+          <w:p>
+            <w:pPr>
+              <w:pStyle w:val="Compact"/>
+            </w:pPr>
+            <w:r>
+              <w:t xml:space="preserve">TC-TRADE-003</w:t>
+            </w:r>
+          </w:p>
+        </w:tc>
+        <w:tc>
+          <w:tcPr/>
+          <w:p>
+            <w:pPr>
+              <w:pStyle w:val="Compact"/>
+            </w:pPr>
+            <w:r>
+              <w:t xml:space="preserve">TC-004</w:t>
+            </w:r>
+          </w:p>
+        </w:tc>
+        <w:tc>
+          <w:tcPr/>
+          <w:p>
+            <w:pPr>
+              <w:pStyle w:val="Compact"/>
+            </w:pPr>
+            <w:r>
+              <w:t xml:space="preserve">REQ-FR-032</w:t>
+            </w:r>
+          </w:p>
+        </w:tc>
+        <w:tc>
+          <w:tcPr/>
+          <w:p>
+            <w:pPr>
+              <w:pStyle w:val="Compact"/>
+            </w:pPr>
+            <w:r>
+              <w:t xml:space="preserve">S-4 Detailed Regression</w:t>
+            </w:r>
+          </w:p>
+        </w:tc>
+      </w:tr>
+      <w:tr>
+        <w:tc>
+          <w:tcPr/>
+          <w:p>
+            <w:pPr>
+              <w:pStyle w:val="Compact"/>
+            </w:pPr>
+            <w:r>
+              <w:t xml:space="preserve">TC-TRADE-004</w:t>
+            </w:r>
+          </w:p>
+        </w:tc>
+        <w:tc>
+          <w:tcPr/>
+          <w:p>
+            <w:pPr>
+              <w:pStyle w:val="Compact"/>
+            </w:pPr>
+            <w:r>
+              <w:t xml:space="preserve">TC-001–TC-005</w:t>
+            </w:r>
+          </w:p>
+        </w:tc>
+        <w:tc>
+          <w:tcPr/>
+          <w:p>
+            <w:pPr>
+              <w:pStyle w:val="Compact"/>
+            </w:pPr>
+            <w:r>
+              <w:t xml:space="preserve">REQ-FR-033</w:t>
+            </w:r>
+          </w:p>
+        </w:tc>
+        <w:tc>
+          <w:tcPr/>
+          <w:p>
+            <w:pPr>
+              <w:pStyle w:val="Compact"/>
+            </w:pPr>
+            <w:r>
+              <w:t xml:space="preserve">S-1 Smoke, S-4 Regression</w:t>
+            </w:r>
+          </w:p>
+        </w:tc>
+      </w:tr>
+      <w:tr>
+        <w:tc>
+          <w:tcPr/>
+          <w:p>
+            <w:pPr>
+              <w:pStyle w:val="Compact"/>
+            </w:pPr>
+            <w:r>
+              <w:t xml:space="preserve">TC-TRADE-005</w:t>
+            </w:r>
+          </w:p>
+        </w:tc>
+        <w:tc>
+          <w:tcPr/>
+          <w:p>
+            <w:pPr>
+              <w:pStyle w:val="Compact"/>
+            </w:pPr>
+            <w:r>
+              <w:t xml:space="preserve">TC-001</w:t>
+            </w:r>
+          </w:p>
+        </w:tc>
+        <w:tc>
+          <w:tcPr/>
+          <w:p>
+            <w:pPr>
+              <w:pStyle w:val="Compact"/>
+            </w:pPr>
+            <w:r>
+              <w:t xml:space="preserve">REQ-FR-034</w:t>
+            </w:r>
+          </w:p>
+        </w:tc>
+        <w:tc>
+          <w:tcPr/>
+          <w:p>
+            <w:pPr>
+              <w:pStyle w:val="Compact"/>
+            </w:pPr>
+            <w:r>
+              <w:t xml:space="preserve">S-1 Smoke</w:t>
+            </w:r>
+          </w:p>
+        </w:tc>
+      </w:tr>
+      <w:tr>
+        <w:tc>
+          <w:tcPr/>
+          <w:p>
+            <w:pPr>
+              <w:pStyle w:val="Compact"/>
+            </w:pPr>
+            <w:r>
+              <w:t xml:space="preserve">TC-TRADE-006</w:t>
+            </w:r>
+          </w:p>
+        </w:tc>
+        <w:tc>
+          <w:tcPr/>
+          <w:p>
+            <w:pPr>
+              <w:pStyle w:val="Compact"/>
+            </w:pPr>
+            <w:r>
+              <w:t xml:space="preserve">TC-009</w:t>
+            </w:r>
+          </w:p>
+        </w:tc>
+        <w:tc>
+          <w:tcPr/>
+          <w:p>
+            <w:pPr>
+              <w:pStyle w:val="Compact"/>
+            </w:pPr>
+            <w:r>
+              <w:t xml:space="preserve">REQ-FR-035</w:t>
+            </w:r>
+          </w:p>
+        </w:tc>
+        <w:tc>
+          <w:tcPr/>
+          <w:p>
+            <w:pPr>
+              <w:pStyle w:val="Compact"/>
+            </w:pPr>
+            <w:r>
+              <w:t xml:space="preserve">S-4 Detailed Regression</w:t>
+            </w:r>
+          </w:p>
+        </w:tc>
+      </w:tr>
+      <w:tr>
+        <w:tc>
+          <w:tcPr/>
+          <w:p>
+            <w:pPr>
+              <w:pStyle w:val="Compact"/>
+            </w:pPr>
+            <w:r>
+              <w:t xml:space="preserve">TC-QUEUE-001</w:t>
+            </w:r>
+          </w:p>
+        </w:tc>
+        <w:tc>
+          <w:tcPr/>
+          <w:p>
+            <w:pPr>
+              <w:pStyle w:val="Compact"/>
+            </w:pPr>
+            <w:r>
+              <w:t xml:space="preserve">TC-001, TC-002, TC-004</w:t>
+            </w:r>
+          </w:p>
+        </w:tc>
+        <w:tc>
+          <w:tcPr/>
+          <w:p>
+            <w:pPr>
+              <w:pStyle w:val="Compact"/>
+            </w:pPr>
+            <w:r>
+              <w:t xml:space="preserve">REQ-FR-040</w:t>
+            </w:r>
+          </w:p>
+        </w:tc>
+        <w:tc>
+          <w:tcPr/>
+          <w:p>
+            <w:pPr>
+              <w:pStyle w:val="Compact"/>
+            </w:pPr>
+            <w:r>
+              <w:t xml:space="preserve">S-1 Smoke, S-4 Regression</w:t>
+            </w:r>
+          </w:p>
+        </w:tc>
+      </w:tr>
+      <w:tr>
+        <w:tc>
+          <w:tcPr/>
+          <w:p>
+            <w:pPr>
+              <w:pStyle w:val="Compact"/>
+            </w:pPr>
+            <w:r>
+              <w:t xml:space="preserve">TC-QUEUE-002</w:t>
+            </w:r>
+          </w:p>
+        </w:tc>
+        <w:tc>
+          <w:tcPr/>
+          <w:p>
+            <w:pPr>
+              <w:pStyle w:val="Compact"/>
+            </w:pPr>
+            <w:r>
+              <w:t xml:space="preserve">TC-002, TC-012</w:t>
+            </w:r>
+          </w:p>
+        </w:tc>
+        <w:tc>
+          <w:tcPr/>
+          <w:p>
+            <w:pPr>
+              <w:pStyle w:val="Compact"/>
+            </w:pPr>
+            <w:r>
+              <w:t xml:space="preserve">REQ-FR-041</w:t>
+            </w:r>
+          </w:p>
+        </w:tc>
+        <w:tc>
+          <w:tcPr/>
+          <w:p>
+            <w:pPr>
+              <w:pStyle w:val="Compact"/>
+            </w:pPr>
+            <w:r>
+              <w:t xml:space="preserve">S-4 Detailed Regression</w:t>
+            </w:r>
+          </w:p>
+        </w:tc>
+      </w:tr>
+      <w:tr>
+        <w:tc>
+          <w:tcPr/>
+          <w:p>
+            <w:pPr>
+              <w:pStyle w:val="Compact"/>
+            </w:pPr>
+            <w:r>
+              <w:t xml:space="preserve">TC-QUEUE-003</w:t>
+            </w:r>
+          </w:p>
+        </w:tc>
+        <w:tc>
+          <w:tcPr/>
+          <w:p>
+            <w:pPr>
+              <w:pStyle w:val="Compact"/>
+            </w:pPr>
+            <w:r>
+              <w:t xml:space="preserve">TC-002, TC-012</w:t>
+            </w:r>
+          </w:p>
+        </w:tc>
+        <w:tc>
+          <w:tcPr/>
+          <w:p>
+            <w:pPr>
+              <w:pStyle w:val="Compact"/>
+            </w:pPr>
+            <w:r>
+              <w:t xml:space="preserve">REQ-FR-042</w:t>
+            </w:r>
+          </w:p>
+        </w:tc>
+        <w:tc>
+          <w:tcPr/>
+          <w:p>
+            <w:pPr>
+              <w:pStyle w:val="Compact"/>
+            </w:pPr>
+            <w:r>
+              <w:t xml:space="preserve">S-4 Detailed Regression</w:t>
+            </w:r>
+          </w:p>
+        </w:tc>
+      </w:tr>
+      <w:tr>
+        <w:tc>
+          <w:tcPr/>
+          <w:p>
+            <w:pPr>
+              <w:pStyle w:val="Compact"/>
+            </w:pPr>
+            <w:r>
+              <w:t xml:space="preserve">TC-QUEUE-004</w:t>
+            </w:r>
+          </w:p>
+        </w:tc>
+        <w:tc>
+          <w:tcPr/>
+          <w:p>
+            <w:pPr>
+              <w:pStyle w:val="Compact"/>
+            </w:pPr>
+            <w:r>
+              <w:t xml:space="preserve">TC-001, TC-003, TC-005</w:t>
+            </w:r>
+          </w:p>
+        </w:tc>
+        <w:tc>
+          <w:tcPr/>
+          <w:p>
+            <w:pPr>
+              <w:pStyle w:val="Compact"/>
+            </w:pPr>
+            <w:r>
+              <w:t xml:space="preserve">REQ-FR-043</w:t>
+            </w:r>
+          </w:p>
+        </w:tc>
+        <w:tc>
+          <w:tcPr/>
+          <w:p>
+            <w:pPr>
+              <w:pStyle w:val="Compact"/>
+            </w:pPr>
+            <w:r>
+              <w:t xml:space="preserve">S-1 Smoke, S-4 Regression</w:t>
+            </w:r>
+          </w:p>
+        </w:tc>
+      </w:tr>
+      <w:tr>
+        <w:tc>
+          <w:tcPr/>
+          <w:p>
+            <w:pPr>
+              <w:pStyle w:val="Compact"/>
+            </w:pPr>
+            <w:r>
+              <w:t xml:space="preserve">TC-QUEUE-005</w:t>
+            </w:r>
+          </w:p>
+        </w:tc>
+        <w:tc>
+          <w:tcPr/>
+          <w:p>
+            <w:pPr>
+              <w:pStyle w:val="Compact"/>
+            </w:pPr>
+            <w:r>
+              <w:t xml:space="preserve">TC-001</w:t>
+            </w:r>
+          </w:p>
+        </w:tc>
+        <w:tc>
+          <w:tcPr/>
+          <w:p>
+            <w:pPr>
+              <w:pStyle w:val="Compact"/>
+            </w:pPr>
+            <w:r>
+              <w:t xml:space="preserve">REQ-FR-044</w:t>
+            </w:r>
+          </w:p>
+        </w:tc>
+        <w:tc>
+          <w:tcPr/>
+          <w:p>
+            <w:pPr>
+              <w:pStyle w:val="Compact"/>
+            </w:pPr>
+            <w:r>
+              <w:t xml:space="preserve">S-1 Smoke</w:t>
+            </w:r>
+          </w:p>
+        </w:tc>
+      </w:tr>
+      <w:tr>
+        <w:tc>
+          <w:tcPr/>
+          <w:p>
+            <w:pPr>
+              <w:pStyle w:val="Compact"/>
+            </w:pPr>
+            <w:r>
+              <w:t xml:space="preserve">TC-QUEUE-006</w:t>
+            </w:r>
+          </w:p>
+        </w:tc>
+        <w:tc>
+          <w:tcPr/>
+          <w:p>
+            <w:pPr>
+              <w:pStyle w:val="Compact"/>
+            </w:pPr>
+            <w:r>
+              <w:t xml:space="preserve">TC-001</w:t>
+            </w:r>
+          </w:p>
+        </w:tc>
+        <w:tc>
+          <w:tcPr/>
+          <w:p>
+            <w:pPr>
+              <w:pStyle w:val="Compact"/>
+            </w:pPr>
+            <w:r>
+              <w:t xml:space="preserve">REQ-FR-045</w:t>
+            </w:r>
+          </w:p>
+        </w:tc>
+        <w:tc>
+          <w:tcPr/>
+          <w:p>
+            <w:pPr>
+              <w:pStyle w:val="Compact"/>
+            </w:pPr>
+            <w:r>
+              <w:t xml:space="preserve">S-1 Smoke</w:t>
+            </w:r>
+          </w:p>
+        </w:tc>
+      </w:tr>
+      <w:tr>
+        <w:tc>
+          <w:tcPr/>
+          <w:p>
+            <w:pPr>
+              <w:pStyle w:val="Compact"/>
+            </w:pPr>
+            <w:r>
+              <w:t xml:space="preserve">TC-LIST-001</w:t>
+            </w:r>
+          </w:p>
+        </w:tc>
+        <w:tc>
+          <w:tcPr/>
+          <w:p>
+            <w:pPr>
+              <w:pStyle w:val="Compact"/>
+            </w:pPr>
+            <w:r>
+              <w:t xml:space="preserve">TC-003, TC-005, TC-011</w:t>
+            </w:r>
+          </w:p>
+        </w:tc>
+        <w:tc>
+          <w:tcPr/>
+          <w:p>
+            <w:pPr>
+              <w:pStyle w:val="Compact"/>
+            </w:pPr>
+            <w:r>
+              <w:t xml:space="preserve">REQ-FR-050</w:t>
+            </w:r>
+          </w:p>
+        </w:tc>
+        <w:tc>
+          <w:tcPr/>
+          <w:p>
+            <w:pPr>
+              <w:pStyle w:val="Compact"/>
+            </w:pPr>
+            <w:r>
+              <w:t xml:space="preserve">S-4 Detailed Regression</w:t>
+            </w:r>
+          </w:p>
+        </w:tc>
+      </w:tr>
+      <w:tr>
+        <w:tc>
+          <w:tcPr/>
+          <w:p>
+            <w:pPr>
+              <w:pStyle w:val="Compact"/>
+            </w:pPr>
+            <w:r>
+              <w:t xml:space="preserve">TC-LIST-002</w:t>
+            </w:r>
+          </w:p>
+        </w:tc>
+        <w:tc>
+          <w:tcPr/>
+          <w:p>
+            <w:pPr>
+              <w:pStyle w:val="Compact"/>
+            </w:pPr>
+            <w:r>
+              <w:t xml:space="preserve">TC-003, TC-005, TC-011</w:t>
+            </w:r>
+          </w:p>
+        </w:tc>
+        <w:tc>
+          <w:tcPr/>
+          <w:p>
+            <w:pPr>
+              <w:pStyle w:val="Compact"/>
+            </w:pPr>
+            <w:r>
+              <w:t xml:space="preserve">REQ-FR-051</w:t>
+            </w:r>
+          </w:p>
+        </w:tc>
+        <w:tc>
+          <w:tcPr/>
+          <w:p>
+            <w:pPr>
+              <w:pStyle w:val="Compact"/>
+            </w:pPr>
+            <w:r>
+              <w:t xml:space="preserve">S-4 Detailed Regression</w:t>
+            </w:r>
+          </w:p>
+        </w:tc>
+      </w:tr>
+      <w:tr>
+        <w:tc>
+          <w:tcPr/>
+          <w:p>
+            <w:pPr>
+              <w:pStyle w:val="Compact"/>
+            </w:pPr>
+            <w:r>
+              <w:t xml:space="preserve">TC-ADM-001</w:t>
+            </w:r>
+          </w:p>
+        </w:tc>
+        <w:tc>
+          <w:tcPr/>
+          <w:p>
+            <w:pPr>
+              <w:pStyle w:val="Compact"/>
+            </w:pPr>
+            <w:r>
+              <w:t xml:space="preserve">TC-015</w:t>
+            </w:r>
+          </w:p>
+        </w:tc>
+        <w:tc>
+          <w:tcPr/>
+          <w:p>
+            <w:pPr>
+              <w:pStyle w:val="Compact"/>
+            </w:pPr>
+            <w:r>
+              <w:t xml:space="preserve">REQ-FR-060</w:t>
+            </w:r>
+          </w:p>
+        </w:tc>
+        <w:tc>
+          <w:tcPr/>
+          <w:p>
+            <w:pPr>
+              <w:pStyle w:val="Compact"/>
+            </w:pPr>
+            <w:r>
+              <w:t xml:space="preserve">S-2 Navigation</w:t>
+            </w:r>
+          </w:p>
+        </w:tc>
+      </w:tr>
+      <w:tr>
+        <w:tc>
+          <w:tcPr/>
+          <w:p>
+            <w:pPr>
+              <w:pStyle w:val="Compact"/>
+            </w:pPr>
+            <w:r>
+              <w:t xml:space="preserve">TC-NFR-001</w:t>
+            </w:r>
+          </w:p>
+        </w:tc>
+        <w:tc>
+          <w:tcPr/>
+          <w:p>
+            <w:pPr>
+              <w:pStyle w:val="Compact"/>
+            </w:pPr>
+            <w:r>
+              <w:t xml:space="preserve">TC-016</w:t>
+            </w:r>
+          </w:p>
+        </w:tc>
+        <w:tc>
+          <w:tcPr/>
+          <w:p>
+            <w:pPr>
+              <w:pStyle w:val="Compact"/>
+            </w:pPr>
+            <w:r>
+              <w:t xml:space="preserve">REQ-NFR-001</w:t>
+            </w:r>
+          </w:p>
+        </w:tc>
+        <w:tc>
+          <w:tcPr/>
+          <w:p>
+            <w:pPr>
+              <w:pStyle w:val="Compact"/>
+            </w:pPr>
+            <w:r>
+              <w:t xml:space="preserve">S-5 NFR Evidence</w:t>
+            </w:r>
+          </w:p>
+        </w:tc>
+      </w:tr>
+      <w:tr>
+        <w:tc>
+          <w:tcPr/>
+          <w:p>
+            <w:pPr>
+              <w:pStyle w:val="Compact"/>
+            </w:pPr>
+            <w:r>
+              <w:t xml:space="preserve">TC-NFR-002</w:t>
+            </w:r>
+          </w:p>
+        </w:tc>
+        <w:tc>
+          <w:tcPr/>
+          <w:p>
+            <w:pPr>
+              <w:pStyle w:val="Compact"/>
+            </w:pPr>
+            <w:r>
+              <w:t xml:space="preserve">TC-016</w:t>
+            </w:r>
+          </w:p>
+        </w:tc>
+        <w:tc>
+          <w:tcPr/>
+          <w:p>
+            <w:pPr>
+              <w:pStyle w:val="Compact"/>
+            </w:pPr>
+            <w:r>
+              <w:t xml:space="preserve">REQ-NFR-002</w:t>
+            </w:r>
+          </w:p>
+        </w:tc>
+        <w:tc>
+          <w:tcPr/>
+          <w:p>
+            <w:pPr>
+              <w:pStyle w:val="Compact"/>
+            </w:pPr>
+            <w:r>
+              <w:t xml:space="preserve">S-5 NFR Evidence</w:t>
+            </w:r>
+          </w:p>
+        </w:tc>
+      </w:tr>
+      <w:tr>
+        <w:tc>
+          <w:tcPr/>
+          <w:p>
+            <w:pPr>
+              <w:pStyle w:val="Compact"/>
+            </w:pPr>
+            <w:r>
+              <w:t xml:space="preserve">TC-NFR-003</w:t>
+            </w:r>
+          </w:p>
+        </w:tc>
+        <w:tc>
+          <w:tcPr/>
+          <w:p>
+            <w:pPr>
+              <w:pStyle w:val="Compact"/>
+            </w:pPr>
+            <w:r>
+              <w:t xml:space="preserve">— (Planned)</w:t>
+            </w:r>
+          </w:p>
+        </w:tc>
+        <w:tc>
+          <w:tcPr/>
+          <w:p>
+            <w:pPr>
+              <w:pStyle w:val="Compact"/>
+            </w:pPr>
+            <w:r>
+              <w:t xml:space="preserve">REQ-NFR-003</w:t>
+            </w:r>
+          </w:p>
+        </w:tc>
+        <w:tc>
+          <w:tcPr/>
+          <w:p>
+            <w:pPr>
+              <w:pStyle w:val="Compact"/>
+            </w:pPr>
+            <w:r>
+              <w:t xml:space="preserve">—</w:t>
+            </w:r>
+          </w:p>
+        </w:tc>
+      </w:tr>
+      <w:tr>
+        <w:tc>
+          <w:tcPr/>
+          <w:p>
+            <w:pPr>
+              <w:pStyle w:val="Compact"/>
+            </w:pPr>
+            <w:r>
+              <w:t xml:space="preserve">TC-NFR-004</w:t>
+            </w:r>
+          </w:p>
+        </w:tc>
+        <w:tc>
+          <w:tcPr/>
+          <w:p>
+            <w:pPr>
+              <w:pStyle w:val="Compact"/>
+            </w:pPr>
+            <w:r>
+              <w:t xml:space="preserve">TC-012</w:t>
+            </w:r>
+          </w:p>
+        </w:tc>
+        <w:tc>
+          <w:tcPr/>
+          <w:p>
+            <w:pPr>
+              <w:pStyle w:val="Compact"/>
+            </w:pPr>
+            <w:r>
+              <w:t xml:space="preserve">REQ-NFR-004</w:t>
+            </w:r>
+          </w:p>
+        </w:tc>
+        <w:tc>
+          <w:tcPr/>
+          <w:p>
+            <w:pPr>
+              <w:pStyle w:val="Compact"/>
+            </w:pPr>
+            <w:r>
+              <w:t xml:space="preserve">S-4 Detailed Regression</w:t>
+            </w:r>
+          </w:p>
+        </w:tc>
+      </w:tr>
+      <w:tr>
+        <w:tc>
+          <w:tcPr/>
+          <w:p>
+            <w:pPr>
+              <w:pStyle w:val="Compact"/>
+            </w:pPr>
+            <w:r>
+              <w:t xml:space="preserve">TC-NFR-005</w:t>
+            </w:r>
+          </w:p>
+        </w:tc>
+        <w:tc>
+          <w:tcPr/>
+          <w:p>
+            <w:pPr>
+              <w:pStyle w:val="Compact"/>
+            </w:pPr>
+            <w:r>
+              <w:t xml:space="preserve">— (Planned)</w:t>
+            </w:r>
+          </w:p>
+        </w:tc>
+        <w:tc>
+          <w:tcPr/>
+          <w:p>
+            <w:pPr>
+              <w:pStyle w:val="Compact"/>
+            </w:pPr>
+            <w:r>
+              <w:t xml:space="preserve">REQ-NFR-005</w:t>
+            </w:r>
+          </w:p>
+        </w:tc>
+        <w:tc>
+          <w:tcPr/>
+          <w:p>
+            <w:pPr>
+              <w:pStyle w:val="Compact"/>
+            </w:pPr>
+            <w:r>
+              <w:t xml:space="preserve">—</w:t>
+            </w:r>
+          </w:p>
+        </w:tc>
+      </w:tr>
+      <w:tr>
+        <w:tc>
+          <w:tcPr/>
+          <w:p>
+            <w:pPr>
+              <w:pStyle w:val="Compact"/>
+            </w:pPr>
+            <w:r>
+              <w:t xml:space="preserve">TC-SEC-001</w:t>
+            </w:r>
+          </w:p>
+        </w:tc>
+        <w:tc>
+          <w:tcPr/>
+          <w:p>
+            <w:pPr>
+              <w:pStyle w:val="Compact"/>
+            </w:pPr>
+            <w:r>
+              <w:t xml:space="preserve">TC-013</w:t>
+            </w:r>
+          </w:p>
+        </w:tc>
+        <w:tc>
+          <w:tcPr/>
+          <w:p>
+            <w:pPr>
+              <w:pStyle w:val="Compact"/>
+            </w:pPr>
+            <w:r>
+              <w:t xml:space="preserve">REQ-SEC-001</w:t>
+            </w:r>
+          </w:p>
+        </w:tc>
+        <w:tc>
+          <w:tcPr/>
+          <w:p>
+            <w:pPr>
+              <w:pStyle w:val="Compact"/>
+            </w:pPr>
+            <w:r>
+              <w:t xml:space="preserve">S-4 Detailed Regression</w:t>
+            </w:r>
+          </w:p>
+        </w:tc>
+      </w:tr>
+      <w:tr>
+        <w:tc>
+          <w:tcPr/>
+          <w:p>
+            <w:pPr>
+              <w:pStyle w:val="Compact"/>
+            </w:pPr>
+            <w:r>
+              <w:t xml:space="preserve">TC-SEC-002</w:t>
+            </w:r>
+          </w:p>
+        </w:tc>
+        <w:tc>
+          <w:tcPr/>
+          <w:p>
+            <w:pPr>
+              <w:pStyle w:val="Compact"/>
+            </w:pPr>
+            <w:r>
+              <w:t xml:space="preserve">TC-007</w:t>
+            </w:r>
+          </w:p>
+        </w:tc>
+        <w:tc>
+          <w:tcPr/>
+          <w:p>
+            <w:pPr>
+              <w:pStyle w:val="Compact"/>
+            </w:pPr>
+            <w:r>
+              <w:t xml:space="preserve">REQ-SEC-002</w:t>
+            </w:r>
+          </w:p>
+        </w:tc>
+        <w:tc>
+          <w:tcPr/>
+          <w:p>
+            <w:pPr>
+              <w:pStyle w:val="Compact"/>
+            </w:pPr>
+            <w:r>
+              <w:t xml:space="preserve">S-3 Negative</w:t>
+            </w:r>
+          </w:p>
+        </w:tc>
+      </w:tr>
+      <w:tr>
+        <w:tc>
+          <w:tcPr/>
+          <w:p>
+            <w:pPr>
+              <w:pStyle w:val="Compact"/>
+            </w:pPr>
+            <w:r>
+              <w:t xml:space="preserve">TC-SEC-003</w:t>
+            </w:r>
+          </w:p>
+        </w:tc>
+        <w:tc>
+          <w:tcPr/>
+          <w:p>
+            <w:pPr>
+              <w:pStyle w:val="Compact"/>
+            </w:pPr>
+            <w:r>
+              <w:t xml:space="preserve">— (Planned)</w:t>
+            </w:r>
+          </w:p>
+        </w:tc>
+        <w:tc>
+          <w:tcPr/>
+          <w:p>
+            <w:pPr>
+              <w:pStyle w:val="Compact"/>
+            </w:pPr>
+            <w:r>
+              <w:t xml:space="preserve">REQ-SEC-003</w:t>
+            </w:r>
+          </w:p>
+        </w:tc>
+        <w:tc>
+          <w:tcPr/>
+          <w:p>
+            <w:pPr>
+              <w:pStyle w:val="Compact"/>
+            </w:pPr>
+            <w:r>
+              <w:t xml:space="preserve">—</w:t>
+            </w:r>
+          </w:p>
+        </w:tc>
+      </w:tr>
+    </w:tbl>
     <w:p>
       <w:r>
         <w:pict>
@@ -4719,23 +6537,15 @@
         </w:pict>
       </w:r>
     </w:p>
+    <w:bookmarkEnd w:id="19"/>
     <w:bookmarkEnd w:id="20"/>
-    <w:bookmarkStart w:id="24" w:name="Xb77d8e61e92adf16be866d63270f8d8e3deb6b4"/>
+    <w:bookmarkStart w:id="21" w:name="change-process"/>
     <w:p>
       <w:pPr>
         <w:pStyle w:val="Heading2"/>
       </w:pPr>
       <w:r>
-        <w:t xml:space="preserve">8. Expanded narrative traceability (audit-friendly)</w:t>
-      </w:r>
-    </w:p>
-    <w:bookmarkStart w:id="21" w:name="br-001-chain"/>
-    <w:p>
-      <w:pPr>
-        <w:pStyle w:val="Heading3"/>
-      </w:pPr>
-      <w:r>
-        <w:t xml:space="preserve">8.1 BR-001 chain</w:t>
+        <w:t xml:space="preserve">7. Change process</w:t>
       </w:r>
     </w:p>
     <w:p>
@@ -4743,6 +6553,40 @@
         <w:pStyle w:val="FirstParagraph"/>
       </w:pPr>
       <w:r>
+        <w:t xml:space="preserve">RTM updates require: REQ change in FRS → new row → tracker sync → TDS TD block.</w:t>
+      </w:r>
+    </w:p>
+    <w:p>
+      <w:r>
+        <w:pict>
+          <v:rect style="width:0;height:1.5pt" o:hralign="center" o:hrstd="t" o:hr="t"/>
+        </w:pict>
+      </w:r>
+    </w:p>
+    <w:bookmarkEnd w:id="21"/>
+    <w:bookmarkStart w:id="25" w:name="Xb77d8e61e92adf16be866d63270f8d8e3deb6b4"/>
+    <w:p>
+      <w:pPr>
+        <w:pStyle w:val="Heading2"/>
+      </w:pPr>
+      <w:r>
+        <w:t xml:space="preserve">8. Expanded narrative traceability (audit-friendly)</w:t>
+      </w:r>
+    </w:p>
+    <w:bookmarkStart w:id="22" w:name="br-001-chain"/>
+    <w:p>
+      <w:pPr>
+        <w:pStyle w:val="Heading3"/>
+      </w:pPr>
+      <w:r>
+        <w:t xml:space="preserve">8.1 BR-001 chain</w:t>
+      </w:r>
+    </w:p>
+    <w:p>
+      <w:pPr>
+        <w:pStyle w:val="FirstParagraph"/>
+      </w:pPr>
+      <w:r>
         <w:rPr>
           <w:b/>
           <w:bCs/>
@@ -4804,8 +6648,8 @@
         <w:t xml:space="preserve">TKT-QAMVP-101/102 group execution ownership.</w:t>
       </w:r>
     </w:p>
-    <w:bookmarkEnd w:id="21"/>
-    <w:bookmarkStart w:id="22" w:name="br-004-chain"/>
+    <w:bookmarkEnd w:id="22"/>
+    <w:bookmarkStart w:id="23" w:name="br-004-chain"/>
     <w:p>
       <w:pPr>
         <w:pStyle w:val="Heading3"/>
@@ -4864,8 +6708,8 @@
         <w:t xml:space="preserve">TC-QUEUE-004/006 for approve + state transition.</w:t>
       </w:r>
     </w:p>
-    <w:bookmarkEnd w:id="22"/>
-    <w:bookmarkStart w:id="23" w:name="br-005-chain"/>
+    <w:bookmarkEnd w:id="23"/>
+    <w:bookmarkStart w:id="24" w:name="br-005-chain"/>
     <w:p>
       <w:pPr>
         <w:pStyle w:val="Heading3"/>
@@ -4931,9 +6775,9 @@
         </w:pict>
       </w:r>
     </w:p>
-    <w:bookmarkEnd w:id="23"/>
     <w:bookmarkEnd w:id="24"/>
-    <w:bookmarkStart w:id="25" w:name="Xcb2bd773a28e56cf66e774f03d9f7ff708ed873"/>
+    <w:bookmarkEnd w:id="25"/>
+    <w:bookmarkStart w:id="26" w:name="Xcb2bd773a28e56cf66e774f03d9f7ff708ed873"/>
     <w:p>
       <w:pPr>
         <w:pStyle w:val="Heading2"/>
@@ -5069,8 +6913,8 @@
         </w:pict>
       </w:r>
     </w:p>
-    <w:bookmarkEnd w:id="25"/>
-    <w:bookmarkStart w:id="28" w:name="appendices"/>
+    <w:bookmarkEnd w:id="26"/>
+    <w:bookmarkStart w:id="29" w:name="appendices"/>
     <w:p>
       <w:pPr>
         <w:pStyle w:val="Heading2"/>
@@ -5079,7 +6923,7 @@
         <w:t xml:space="preserve">10. Appendices</w:t>
       </w:r>
     </w:p>
-    <w:bookmarkStart w:id="26" w:name="appendix-a-id-index-count"/>
+    <w:bookmarkStart w:id="27" w:name="appendix-a-id-index-count"/>
     <w:p>
       <w:pPr>
         <w:pStyle w:val="Heading3"/>
@@ -5160,8 +7004,8 @@
         <w:t xml:space="preserve">16 groups in §5</w:t>
       </w:r>
     </w:p>
-    <w:bookmarkEnd w:id="26"/>
-    <w:bookmarkStart w:id="27" w:name="appendix-b-rtm-maintenance-checklist"/>
+    <w:bookmarkEnd w:id="27"/>
+    <w:bookmarkStart w:id="28" w:name="appendix-b-rtm-maintenance-checklist"/>
     <w:p>
       <w:pPr>
         <w:pStyle w:val="Heading3"/>
@@ -5246,9 +7090,9 @@
         <w:t xml:space="preserve">Source Markdown is authoritative for hyperlinks; Word export is secondary.</w:t>
       </w:r>
     </w:p>
-    <w:bookmarkEnd w:id="27"/>
     <w:bookmarkEnd w:id="28"/>
     <w:bookmarkEnd w:id="29"/>
+    <w:bookmarkEnd w:id="30"/>
     <w:sectPr>
       <w:footnotePr>
         <w:numRestart w:val="eachSect"/>

</xml_diff>